<commit_message>
Remove unused comment from docx export templates and logic for security and cleanliness
</commit_message>
<xml_diff>
--- a/report_template_de.docx
+++ b/report_template_de.docx
@@ -114,11 +114,7 @@
         <w:t>Die Pilotenposition befindet sich bei: N53.827683 E8.791137.</w:t>
       </w:r>
     </w:p>
-    <w:p>
-      <w:r>
-        <w:t>Kommentar: Kein allgemeiner Kommentar zum Projekt.</w:t>
-      </w:r>
-    </w:p>
+    <w:p/>
     <w:p>
       <w:pPr>
         <w:pStyle w:val="berschrift3"/>
@@ -1748,28 +1744,7 @@
         <w:sz w:val="20"/>
         <w:szCs w:val="20"/>
       </w:rPr>
-      <w:t xml:space="preserve">QUCORE </w:t>
-    </w:r>
-    <w:r>
-      <w:rPr>
-        <w:sz w:val="20"/>
-        <w:szCs w:val="20"/>
-      </w:rPr>
-      <w:t xml:space="preserve">– A </w:t>
-    </w:r>
-    <w:r>
-      <w:rPr>
-        <w:sz w:val="20"/>
-        <w:szCs w:val="20"/>
-      </w:rPr>
-      <w:t>QGIS Plugin</w:t>
-    </w:r>
-    <w:r>
-      <w:rPr>
-        <w:sz w:val="20"/>
-        <w:szCs w:val="20"/>
-      </w:rPr>
-      <w:t xml:space="preserve"> </w:t>
+      <w:t xml:space="preserve">QUCORE – A QGIS Plugin </w:t>
     </w:r>
     <w:proofErr w:type="spellStart"/>
     <w:r>
@@ -1785,14 +1760,7 @@
         <w:sz w:val="20"/>
         <w:szCs w:val="20"/>
       </w:rPr>
-      <w:t xml:space="preserve"> </w:t>
-    </w:r>
-    <w:r>
-      <w:rPr>
-        <w:sz w:val="20"/>
-        <w:szCs w:val="20"/>
-      </w:rPr>
-      <w:t>Tim Strohbach</w:t>
+      <w:t xml:space="preserve"> Tim Strohbach</w:t>
     </w:r>
     <w:r>
       <w:rPr>
@@ -2620,6 +2588,7 @@
   <w:style w:type="character" w:default="1" w:styleId="Absatz-Standardschriftart">
     <w:name w:val="Default Paragraph Font"/>
     <w:uiPriority w:val="1"/>
+    <w:semiHidden/>
     <w:unhideWhenUsed/>
   </w:style>
   <w:style w:type="table" w:default="1" w:styleId="NormaleTabelle">

</xml_diff>